<commit_message>
feat: company logo on the AFS cover; note pieces move freely
- Cover prints the company logo (Company Settings) centred above the
  entity name, plus the issue date, in the PDF (JPEG XObject) and Word.
  Uploaded, replaced or switched off from the document's Cover page.
- A note's sections, paragraphs and tables move through one sequence, so a
  paragraph can sit below the tables it explains; new pieces are added at
  the end. Every output follows the same order. Unarranged notes print as
  before.
- Presentation saves are serialised (latest state wins), with a saving
  indicator and a leave-page warning while a save is pending.
- Flipping a note/policy switch back returns it to the engine default
  instead of recording a redundant choice.

Co-Authored-By: Claude Opus 5.5 <noreply@anthropic.com>
</commit_message>
<xml_diff>
--- a/docs/enterprise-accounts-production/V14.0/evidence/AFS_V14_Meridian_current.docx
+++ b/docs/enterprise-accounts-production/V14.0/evidence/AFS_V14_Meridian_current.docx
@@ -1,6 +1,6 @@
 
 <file path=word/document.xml><?xml version="1.0" encoding="utf-8"?>
-<w:document xmlns:w="http://schemas.openxmlformats.org/wordprocessingml/2006/main" xmlns:r="http://schemas.openxmlformats.org/officeDocument/2006/relationships">
+<w:document xmlns:w="http://schemas.openxmlformats.org/wordprocessingml/2006/main" xmlns:r="http://schemas.openxmlformats.org/officeDocument/2006/relationships" xmlns:wp="http://schemas.openxmlformats.org/drawingml/2006/wordprocessingDrawing">
   <w:body>
     <w:p>
       <w:pPr>
@@ -55,10 +55,19 @@
     <w:p>
       <w:pPr>
         <w:jc w:val="center"/>
+        <w:spacing w:after="40"/>
+      </w:pPr>
+      <w:r>
+        <w:t xml:space="preserve">FOR THE YEAR ENDED 31 MARCH 2026</w:t>
+      </w:r>
+    </w:p>
+    <w:p>
+      <w:pPr>
+        <w:jc w:val="center"/>
         <w:spacing w:after="200"/>
       </w:pPr>
       <w:r>
-        <w:t xml:space="preserve">FOR THE YEAR ENDED 31 MARCH 2026</w:t>
+        <w:t xml:space="preserve">Issued 24 June 2026</w:t>
       </w:r>
     </w:p>
     <w:p>

</xml_diff>